<commit_message>
Publish verified public repository availability
</commit_message>
<xml_diff>
--- a/manuscript/scientific_reports_remediated_manuscript.docx
+++ b/manuscript/scientific_reports_remediated_manuscript.docx
@@ -2,7 +2,7 @@
 <file path=word/document.xml><?xml version="1.0" encoding="utf-8"?>
 <w:document xmlns:w="http://schemas.openxmlformats.org/wordprocessingml/2006/main" xmlns:m="http://schemas.openxmlformats.org/officeDocument/2006/math" xmlns:r="http://schemas.openxmlformats.org/officeDocument/2006/relationships" xmlns:o="urn:schemas-microsoft-com:office:office" xmlns:v="urn:schemas-microsoft-com:vml" xmlns:w10="urn:schemas-microsoft-com:office:word" xmlns:a="http://schemas.openxmlformats.org/drawingml/2006/main" xmlns:pic="http://schemas.openxmlformats.org/drawingml/2006/picture" xmlns:wp="http://schemas.openxmlformats.org/drawingml/2006/wordprocessingDrawing">
   <w:body>
-    <w:bookmarkStart w:id="87" w:name="Xbac3e7acbacbf1238569d3a438b3dca075bc017"/>
+    <w:bookmarkStart w:id="89" w:name="Xbac3e7acbacbf1238569d3a438b3dca075bc017"/>
     <w:p>
       <w:pPr>
         <w:pStyle w:val="Heading1"/>
@@ -921,7 +921,7 @@
       </w:r>
     </w:p>
     <w:bookmarkEnd w:id="39"/>
-    <w:bookmarkStart w:id="47" w:name="methods"/>
+    <w:bookmarkStart w:id="48" w:name="methods"/>
     <w:p>
       <w:pPr>
         <w:pStyle w:val="Heading2"/>
@@ -1052,7 +1052,7 @@
       </w:r>
     </w:p>
     <w:bookmarkEnd w:id="44"/>
-    <w:bookmarkStart w:id="45" w:name="reproducibility"/>
+    <w:bookmarkStart w:id="46" w:name="reproducibility"/>
     <w:p>
       <w:pPr>
         <w:pStyle w:val="Heading3"/>
@@ -1066,11 +1066,28 @@
         <w:pStyle w:val="FirstParagraph"/>
       </w:pPr>
       <w:r>
-        <w:t xml:space="preserve">The analysis archived the focused universe, per-study effects, discovery directions, complete random-effects output, external gene tests, pathway permutation results, donor-disjoint sensitivities, sample-level metadata, diagnostics, analysis settings, input hashes, and an output manifest. The execution environment used Python 3.13.9, NumPy 2.3.5, pandas 2.3.3, SciPy 1.16.3, statsmodels 0.14.5, and Matplotlib 3.10.6. M18 recomputed statistical results from frozen processed matrices and cached normalized GEO SOFT values; it did not independently repeat every upstream raw-read or CEL-file preprocessing step. A public immutable repository release and archival DOI remain required before submission.</w:t>
+        <w:t xml:space="preserve">The analysis archived the focused universe, per-study effects, discovery directions, complete random-effects output, external gene tests, pathway permutation results, donor-disjoint sensitivities, sample-level metadata, diagnostics, analysis settings, input hashes, and an output manifest. The execution environment used Python 3.13.9, NumPy 2.3.5, pandas 2.3.3, SciPy 1.16.3, statsmodels 0.14.5, and Matplotlib 3.10.6. M18 recomputed statistical results from frozen processed matrices and cached normalized GEO SOFT values; it did not independently repeat every upstream raw-read or CEL-file preprocessing step. The public versioned code-and-results repository is available at</w:t>
+      </w:r>
+      <w:r>
+        <w:t xml:space="preserve"> </w:t>
+      </w:r>
+      <w:hyperlink r:id="rId45">
+        <w:r>
+          <w:rPr>
+            <w:rStyle w:val="Hyperlink"/>
+          </w:rPr>
+          <w:t xml:space="preserve">https://github.com/denglizhen-113/dkd-focused-universe-reanalysis</w:t>
+        </w:r>
+      </w:hyperlink>
+      <w:r>
+        <w:t xml:space="preserve"> </w:t>
+      </w:r>
+      <w:r>
+        <w:t xml:space="preserve">(version tag v1.0.2).</w:t>
       </w:r>
     </w:p>
-    <w:bookmarkEnd w:id="45"/>
-    <w:bookmarkStart w:id="46" w:name="software-and-archival-limitations"/>
+    <w:bookmarkEnd w:id="46"/>
+    <w:bookmarkStart w:id="47" w:name="software-and-archival-limitations"/>
     <w:p>
       <w:pPr>
         <w:pStyle w:val="Heading3"/>
@@ -1117,9 +1134,9 @@
         <w:t xml:space="preserve">arguments and therefore depended on the recorded package version's defaults. Some older Python stages recorded major/minor but not patch versions. The prior single-nucleus phase did not archive a final h5ad object and was reconstructed from intermediate files; those results are excluded from the present claims. The present reanalysis records its full Python patch versions and does not use the historical limma P values or reconstructed single-nucleus labels for primary inference. These changes improve current reproducibility but do not retrospectively make every upstream historical step raw-data reproducible.</w:t>
       </w:r>
     </w:p>
-    <w:bookmarkEnd w:id="46"/>
     <w:bookmarkEnd w:id="47"/>
-    <w:bookmarkStart w:id="48" w:name="limitations"/>
+    <w:bookmarkEnd w:id="48"/>
+    <w:bookmarkStart w:id="49" w:name="limitations"/>
     <w:p>
       <w:pPr>
         <w:pStyle w:val="Heading2"/>
@@ -1160,8 +1177,8 @@
         <w:t xml:space="preserve">The single-nucleus workflow available for this project lacked reference mapping, doublet detection, expanded UMI and mitochondrial quality thresholds, donor-aware integration, and a complete donor-level pseudobulk analysis. It therefore cannot support cell-type localization claims in the present manuscript.</w:t>
       </w:r>
     </w:p>
-    <w:bookmarkEnd w:id="48"/>
-    <w:bookmarkStart w:id="56" w:name="data-availability"/>
+    <w:bookmarkEnd w:id="49"/>
+    <w:bookmarkStart w:id="58" w:name="data-availability"/>
     <w:p>
       <w:pPr>
         <w:pStyle w:val="Heading2"/>
@@ -1192,7 +1209,7 @@
       <w:r>
         <w:t xml:space="preserve"> </w:t>
       </w:r>
-      <w:hyperlink r:id="rId49">
+      <w:hyperlink r:id="rId50">
         <w:r>
           <w:rPr>
             <w:rStyle w:val="Hyperlink"/>
@@ -1215,7 +1232,7 @@
       <w:r>
         <w:t xml:space="preserve"> </w:t>
       </w:r>
-      <w:hyperlink r:id="rId50">
+      <w:hyperlink r:id="rId51">
         <w:r>
           <w:rPr>
             <w:rStyle w:val="Hyperlink"/>
@@ -1238,7 +1255,7 @@
       <w:r>
         <w:t xml:space="preserve"> </w:t>
       </w:r>
-      <w:hyperlink r:id="rId51">
+      <w:hyperlink r:id="rId52">
         <w:r>
           <w:rPr>
             <w:rStyle w:val="Hyperlink"/>
@@ -1261,7 +1278,7 @@
       <w:r>
         <w:t xml:space="preserve"> </w:t>
       </w:r>
-      <w:hyperlink r:id="rId52">
+      <w:hyperlink r:id="rId53">
         <w:r>
           <w:rPr>
             <w:rStyle w:val="Hyperlink"/>
@@ -1284,7 +1301,7 @@
       <w:r>
         <w:t xml:space="preserve"> </w:t>
       </w:r>
-      <w:hyperlink r:id="rId53">
+      <w:hyperlink r:id="rId54">
         <w:r>
           <w:rPr>
             <w:rStyle w:val="Hyperlink"/>
@@ -1307,7 +1324,7 @@
       <w:r>
         <w:t xml:space="preserve"> </w:t>
       </w:r>
-      <w:hyperlink r:id="rId54">
+      <w:hyperlink r:id="rId55">
         <w:r>
           <w:rPr>
             <w:rStyle w:val="Hyperlink"/>
@@ -1330,7 +1347,7 @@
       <w:r>
         <w:t xml:space="preserve"> </w:t>
       </w:r>
-      <w:hyperlink r:id="rId55">
+      <w:hyperlink r:id="rId56">
         <w:r>
           <w:rPr>
             <w:rStyle w:val="Hyperlink"/>
@@ -1344,11 +1361,25 @@
         <w:pStyle w:val="FirstParagraph"/>
       </w:pPr>
       <w:r>
-        <w:t xml:space="preserve">Processed effect-size tables, pathway-permutation results, and analysis manifests require a public archival record with an immutable DOI before submission.</w:t>
+        <w:t xml:space="preserve">Processed effect-size tables, pathway-permutation results, and analysis manifests are available in the public versioned repository at</w:t>
+      </w:r>
+      <w:r>
+        <w:t xml:space="preserve"> </w:t>
+      </w:r>
+      <w:hyperlink r:id="rId57">
+        <w:r>
+          <w:rPr>
+            <w:rStyle w:val="Hyperlink"/>
+          </w:rPr>
+          <w:t xml:space="preserve">https://github.com/denglizhen-113/dkd-focused-universe-reanalysis/tree/v1.0.2</w:t>
+        </w:r>
+      </w:hyperlink>
+      <w:r>
+        <w:t xml:space="preserve">.</w:t>
       </w:r>
     </w:p>
-    <w:bookmarkEnd w:id="56"/>
-    <w:bookmarkStart w:id="57" w:name="code-availability"/>
+    <w:bookmarkEnd w:id="58"/>
+    <w:bookmarkStart w:id="59" w:name="code-availability"/>
     <w:p>
       <w:pPr>
         <w:pStyle w:val="Heading2"/>
@@ -1362,11 +1393,28 @@
         <w:pStyle w:val="FirstParagraph"/>
       </w:pPr>
       <w:r>
-        <w:t xml:space="preserve">Analysis code, environment specifications, source-data tables, and machine-readable manifests require a public version-controlled release and a permanent archival DOI before submission.</w:t>
+        <w:t xml:space="preserve">Analysis code, environment specifications, source-data tables, and machine-readable manifests are publicly available at</w:t>
+      </w:r>
+      <w:r>
+        <w:t xml:space="preserve"> </w:t>
+      </w:r>
+      <w:hyperlink r:id="rId57">
+        <w:r>
+          <w:rPr>
+            <w:rStyle w:val="Hyperlink"/>
+          </w:rPr>
+          <w:t xml:space="preserve">https://github.com/denglizhen-113/dkd-focused-universe-reanalysis/tree/v1.0.2</w:t>
+        </w:r>
+      </w:hyperlink>
+      <w:r>
+        <w:t xml:space="preserve"> </w:t>
+      </w:r>
+      <w:r>
+        <w:t xml:space="preserve">(version tag v1.0.2). A DOI-minting archival record may be added in a subsequent release.</w:t>
       </w:r>
     </w:p>
-    <w:bookmarkEnd w:id="57"/>
-    <w:bookmarkStart w:id="71" w:name="references"/>
+    <w:bookmarkEnd w:id="59"/>
+    <w:bookmarkStart w:id="73" w:name="references"/>
     <w:p>
       <w:pPr>
         <w:pStyle w:val="Heading2"/>
@@ -1412,7 +1460,7 @@
       <w:r>
         <w:t xml:space="preserve"> </w:t>
       </w:r>
-      <w:hyperlink r:id="rId58">
+      <w:hyperlink r:id="rId60">
         <w:r>
           <w:rPr>
             <w:rStyle w:val="Hyperlink"/>
@@ -1458,7 +1506,7 @@
       <w:r>
         <w:t xml:space="preserve"> </w:t>
       </w:r>
-      <w:hyperlink r:id="rId59">
+      <w:hyperlink r:id="rId61">
         <w:r>
           <w:rPr>
             <w:rStyle w:val="Hyperlink"/>
@@ -1504,7 +1552,7 @@
       <w:r>
         <w:t xml:space="preserve"> </w:t>
       </w:r>
-      <w:hyperlink r:id="rId60">
+      <w:hyperlink r:id="rId62">
         <w:r>
           <w:rPr>
             <w:rStyle w:val="Hyperlink"/>
@@ -1550,7 +1598,7 @@
       <w:r>
         <w:t xml:space="preserve"> </w:t>
       </w:r>
-      <w:hyperlink r:id="rId61">
+      <w:hyperlink r:id="rId63">
         <w:r>
           <w:rPr>
             <w:rStyle w:val="Hyperlink"/>
@@ -1596,7 +1644,7 @@
       <w:r>
         <w:t xml:space="preserve"> </w:t>
       </w:r>
-      <w:hyperlink r:id="rId62">
+      <w:hyperlink r:id="rId64">
         <w:r>
           <w:rPr>
             <w:rStyle w:val="Hyperlink"/>
@@ -1642,7 +1690,7 @@
       <w:r>
         <w:t xml:space="preserve"> </w:t>
       </w:r>
-      <w:hyperlink r:id="rId63">
+      <w:hyperlink r:id="rId65">
         <w:r>
           <w:rPr>
             <w:rStyle w:val="Hyperlink"/>
@@ -1688,7 +1736,7 @@
       <w:r>
         <w:t xml:space="preserve"> </w:t>
       </w:r>
-      <w:hyperlink r:id="rId64">
+      <w:hyperlink r:id="rId66">
         <w:r>
           <w:rPr>
             <w:rStyle w:val="Hyperlink"/>
@@ -1734,7 +1782,7 @@
       <w:r>
         <w:t xml:space="preserve"> </w:t>
       </w:r>
-      <w:hyperlink r:id="rId65">
+      <w:hyperlink r:id="rId67">
         <w:r>
           <w:rPr>
             <w:rStyle w:val="Hyperlink"/>
@@ -1780,7 +1828,7 @@
       <w:r>
         <w:t xml:space="preserve"> </w:t>
       </w:r>
-      <w:hyperlink r:id="rId66">
+      <w:hyperlink r:id="rId68">
         <w:r>
           <w:rPr>
             <w:rStyle w:val="Hyperlink"/>
@@ -1826,7 +1874,7 @@
       <w:r>
         <w:t xml:space="preserve"> </w:t>
       </w:r>
-      <w:hyperlink r:id="rId67">
+      <w:hyperlink r:id="rId69">
         <w:r>
           <w:rPr>
             <w:rStyle w:val="Hyperlink"/>
@@ -1872,7 +1920,7 @@
       <w:r>
         <w:t xml:space="preserve"> </w:t>
       </w:r>
-      <w:hyperlink r:id="rId68">
+      <w:hyperlink r:id="rId70">
         <w:r>
           <w:rPr>
             <w:rStyle w:val="Hyperlink"/>
@@ -1918,7 +1966,7 @@
       <w:r>
         <w:t xml:space="preserve"> </w:t>
       </w:r>
-      <w:hyperlink r:id="rId69">
+      <w:hyperlink r:id="rId71">
         <w:r>
           <w:rPr>
             <w:rStyle w:val="Hyperlink"/>
@@ -1964,7 +2012,7 @@
       <w:r>
         <w:t xml:space="preserve"> </w:t>
       </w:r>
-      <w:hyperlink r:id="rId70">
+      <w:hyperlink r:id="rId72">
         <w:r>
           <w:rPr>
             <w:rStyle w:val="Hyperlink"/>
@@ -1973,8 +2021,8 @@
         </w:r>
       </w:hyperlink>
     </w:p>
-    <w:bookmarkEnd w:id="71"/>
-    <w:bookmarkStart w:id="72" w:name="acknowledgements"/>
+    <w:bookmarkEnd w:id="73"/>
+    <w:bookmarkStart w:id="74" w:name="acknowledgements"/>
     <w:p>
       <w:pPr>
         <w:pStyle w:val="Heading2"/>
@@ -1991,8 +2039,8 @@
         <w:t xml:space="preserve">The author acknowledges the investigators who generated and publicly shared the datasets reanalyzed in this study.</w:t>
       </w:r>
     </w:p>
-    <w:bookmarkEnd w:id="72"/>
-    <w:bookmarkStart w:id="73" w:name="funding"/>
+    <w:bookmarkEnd w:id="74"/>
+    <w:bookmarkStart w:id="75" w:name="funding"/>
     <w:p>
       <w:pPr>
         <w:pStyle w:val="Heading2"/>
@@ -2009,8 +2057,8 @@
         <w:t xml:space="preserve">The author received no specific funding for this work.</w:t>
       </w:r>
     </w:p>
-    <w:bookmarkEnd w:id="73"/>
-    <w:bookmarkStart w:id="74" w:name="ethics-statement"/>
+    <w:bookmarkEnd w:id="75"/>
+    <w:bookmarkStart w:id="76" w:name="ethics-statement"/>
     <w:p>
       <w:pPr>
         <w:pStyle w:val="Heading2"/>
@@ -2027,8 +2075,8 @@
         <w:t xml:space="preserve">This study used publicly available, de-identified human transcriptomic data. No new human or animal samples were collected.</w:t>
       </w:r>
     </w:p>
-    <w:bookmarkEnd w:id="74"/>
-    <w:bookmarkStart w:id="75" w:name="author-contributions"/>
+    <w:bookmarkEnd w:id="76"/>
+    <w:bookmarkStart w:id="77" w:name="author-contributions"/>
     <w:p>
       <w:pPr>
         <w:pStyle w:val="Heading2"/>
@@ -2045,8 +2093,8 @@
         <w:t xml:space="preserve">Lizhen Deng: Conceptualization, methodology, software, formal analysis, investigation, data curation, visualization, writing—original draft, writing—review and editing, and project administration.</w:t>
       </w:r>
     </w:p>
-    <w:bookmarkEnd w:id="75"/>
-    <w:bookmarkStart w:id="76" w:name="competing-interests"/>
+    <w:bookmarkEnd w:id="77"/>
+    <w:bookmarkStart w:id="78" w:name="competing-interests"/>
     <w:p>
       <w:pPr>
         <w:pStyle w:val="Heading2"/>
@@ -2063,8 +2111,8 @@
         <w:t xml:space="preserve">The author declares no competing interests.</w:t>
       </w:r>
     </w:p>
-    <w:bookmarkEnd w:id="76"/>
-    <w:bookmarkStart w:id="77" w:name="ai-disclosure"/>
+    <w:bookmarkEnd w:id="78"/>
+    <w:bookmarkStart w:id="79" w:name="ai-disclosure"/>
     <w:p>
       <w:pPr>
         <w:pStyle w:val="Heading2"/>
@@ -2081,8 +2129,8 @@
         <w:t xml:space="preserve">OpenAI Codex was used under author supervision for code generation, comparison of statistical options, statistical remediation, consistency checks, figure and table preparation, and language drafting. Figures were generated by AI-assisted code from the archived numerical tables; no generative image model was used. The author retains scholarly judgement and responsibility and must independently verify the code, numerical outputs, citations, interpretation, and final submitted text. AI was not used to generate or alter primary data.</w:t>
       </w:r>
     </w:p>
-    <w:bookmarkEnd w:id="77"/>
-    <w:bookmarkStart w:id="82" w:name="figure-legends"/>
+    <w:bookmarkEnd w:id="79"/>
+    <w:bookmarkStart w:id="84" w:name="figure-legends"/>
     <w:p>
       <w:pPr>
         <w:pStyle w:val="Heading2"/>
@@ -2091,7 +2139,7 @@
         <w:t xml:space="preserve">Figure legends</w:t>
       </w:r>
     </w:p>
-    <w:bookmarkStart w:id="78" w:name="X1ccd667c9a598e8d942693c131c959ded9fef90"/>
+    <w:bookmarkStart w:id="80" w:name="X1ccd667c9a598e8d942693c131c959ded9fef90"/>
     <w:p>
       <w:pPr>
         <w:pStyle w:val="Heading3"/>
@@ -2108,8 +2156,8 @@
         <w:t xml:space="preserve">The 145-gene analysis-defined universe was carried through discovery-direction estimation, the three-study synthesis, external gene testing, and pathway permutation. The outcome-dependent 61-gene subset was not used as the primary inferential family. GSE30529 was retained only as a secondary same-study compartment.</w:t>
       </w:r>
     </w:p>
-    <w:bookmarkEnd w:id="78"/>
-    <w:bookmarkStart w:id="79" w:name="X0291e86b83d0abbc78491968fb7b07ad582f958"/>
+    <w:bookmarkEnd w:id="80"/>
+    <w:bookmarkStart w:id="81" w:name="X0291e86b83d0abbc78491968fb7b07ad582f958"/>
     <w:p>
       <w:pPr>
         <w:pStyle w:val="Heading3"/>
@@ -2126,8 +2174,8 @@
         <w:t xml:space="preserve">Panel a shows pooled Hedges' g against the modified Hartung–Knapp P value for genes with complete estimates in GSE142025, GSE96804, and GSE30528. Labels identify the ten smallest unadjusted P values for display only. Panel b shows every study effect, normal 95% confidence interval, random-effects weight, and the modified Hartung–Knapp pooled interval for eight fixed legacy display genes. These genes are not a separate inferential family. No gene met BH FDR&lt;0.05 across the 145-gene family.</w:t>
       </w:r>
     </w:p>
-    <w:bookmarkEnd w:id="79"/>
-    <w:bookmarkStart w:id="80" w:name="Xa03f67726893eed7fbea8d0111a6f684089e5ba"/>
+    <w:bookmarkEnd w:id="81"/>
+    <w:bookmarkStart w:id="82" w:name="Xa03f67726893eed7fbea8d0111a6f684089e5ba"/>
     <w:p>
       <w:pPr>
         <w:pStyle w:val="Heading3"/>
@@ -2144,8 +2192,8 @@
         <w:t xml:space="preserve">Discovery effects combine GSE142025 and GSE96804 without GSE30528. External effects are Hedges' g values from GSE30528. Blue points are direction-concordant genes; dark blue additionally meet external FDR&lt;0.05; red points are direction-discordant. GSE30528 is one external source study.</w:t>
       </w:r>
     </w:p>
-    <w:bookmarkEnd w:id="80"/>
-    <w:bookmarkStart w:id="81" w:name="Xcaaec5bc4a538b2a37f2f72c28c83ec8c886eec"/>
+    <w:bookmarkEnd w:id="82"/>
+    <w:bookmarkStart w:id="83" w:name="Xcaaec5bc4a538b2a37f2f72c28c83ec8c886eec"/>
     <w:p>
       <w:pPr>
         <w:pStyle w:val="Heading3"/>
@@ -2162,9 +2210,9 @@
         <w:t xml:space="preserve">Bars show the mean discovery-direction-aligned Hedges' g for each pathway. Labels report BH FDR over nine pathways. Disease labels were permuted 10,000 times with the 9-versus-13 allocation preserved and all genes recomputed jointly.</w:t>
       </w:r>
     </w:p>
-    <w:bookmarkEnd w:id="81"/>
-    <w:bookmarkEnd w:id="82"/>
-    <w:bookmarkStart w:id="86" w:name="supplementary-legend"/>
+    <w:bookmarkEnd w:id="83"/>
+    <w:bookmarkEnd w:id="84"/>
+    <w:bookmarkStart w:id="88" w:name="supplementary-legend"/>
     <w:p>
       <w:pPr>
         <w:pStyle w:val="Heading2"/>
@@ -2173,7 +2221,7 @@
         <w:t xml:space="preserve">Supplementary legend</w:t>
       </w:r>
     </w:p>
-    <w:bookmarkStart w:id="83" w:name="X5019df9ce357d51b91a06d04162286802feddd5"/>
+    <w:bookmarkStart w:id="85" w:name="X5019df9ce357d51b91a06d04162286802feddd5"/>
     <w:p>
       <w:pPr>
         <w:pStyle w:val="Heading3"/>
@@ -2190,8 +2238,8 @@
         <w:t xml:space="preserve">Points show REML pooled Hedges' g and modified Hartung–Knapp 95% confidence intervals. The figure is descriptive; multiplicity-adjusted results are supplied in Supplementary Table S1.</w:t>
       </w:r>
     </w:p>
-    <w:bookmarkEnd w:id="83"/>
-    <w:bookmarkStart w:id="84" w:name="X2c919d0cb2fc46ea8c3730c1a9964e762a26bfd"/>
+    <w:bookmarkEnd w:id="85"/>
+    <w:bookmarkStart w:id="86" w:name="X2c919d0cb2fc46ea8c3730c1a9964e762a26bfd"/>
     <w:p>
       <w:pPr>
         <w:pStyle w:val="Heading3"/>
@@ -2208,8 +2256,8 @@
         <w:t xml:space="preserve">PCA used the 1,000 most variable genes separately within each primary dataset. Group separation can reflect disease biology, composition, confounding, or unrecorded technical structure.</w:t>
       </w:r>
     </w:p>
-    <w:bookmarkEnd w:id="84"/>
-    <w:bookmarkStart w:id="85" w:name="Xb4519003e57c0171b04f10e483c5e99c6cec3cb"/>
+    <w:bookmarkEnd w:id="86"/>
+    <w:bookmarkStart w:id="87" w:name="Xb4519003e57c0171b04f10e483c5e99c6cec3cb"/>
     <w:p>
       <w:pPr>
         <w:pStyle w:val="Heading3"/>
@@ -2226,9 +2274,9 @@
         <w:t xml:space="preserve">Heatmaps show Pearson correlations computed from the 1,000 most variable genes within each primary dataset. The predefined robust-z outlier audit is reported in Supplementary Table S15.</w:t>
       </w:r>
     </w:p>
-    <w:bookmarkEnd w:id="85"/>
-    <w:bookmarkEnd w:id="86"/>
     <w:bookmarkEnd w:id="87"/>
+    <w:bookmarkEnd w:id="88"/>
+    <w:bookmarkEnd w:id="89"/>
     <w:sectPr>
       <w:footerReference r:id="rId9" w:type="default"/>
       <w:pgSz w:h="15840" w:w="12240"/>

</xml_diff>